<commit_message>
Cerrar v1.5 con supresion completa en salidas publicas
</commit_message>
<xml_diff>
--- a/manuscript/supplement/MATERIAL_SUPLEMENTARIO.docx
+++ b/manuscript/supplement/MATERIAL_SUPLEMENTARIO.docx
@@ -35074,7 +35074,7 @@
           <w:szCs w:val="18"/>
           <w:color w:val="000000"/>
         </w:rPr>
-        <w:t xml:space="preserve">Validación cruzada espacial de 5 pliegues: observado y predicción se agregan con el ponderador calibrado dentro del municipio; BYM2 e IID usan exactamente las mismas filas, pesos y pliegues. Se muestra la reducción de RMSE frente al promedio ponderado de los municipios de entrenamiento de cada pliegue.</w:t>
+        <w:t xml:space="preserve">Validación cruzada espacial de 5 pliegues: observado y predicción se agregan con el ponderador calibrado dentro del municipio; BYM2 e IID usan exactamente las mismas filas, pesos y pliegues. El panel A omite municipios con n&lt;10. El panel B muestra la reducción de RMSE agregada de todos los municipios frente al promedio ponderado del entrenamiento de cada pliegue.</w:t>
       </w:r>
     </w:p>
     <w:p>
@@ -35107,7 +35107,7 @@
           <w:szCs w:val="22"/>
           <w:color w:val="000000"/>
         </w:rPr>
-        <w:t xml:space="preserve">Figura S2. Ancho del intervalo de credibilidad al 95% (criterio ESH).</w:t>
+        <w:t xml:space="preserve">Figura S2. Ancho del intervalo de credibilidad al 95% (criterio ESH; celdas con n&lt;10 suprimidas).</w:t>
       </w:r>
     </w:p>
     <w:p>

</xml_diff>